<commit_message>
Add totality-of-infractions addendum from the class discussion
Summarises the computation and appreciation of infractions as given in
the Part 1 class transcript: the ladder of penalties, express and implied
condonation, the limitations on the power to discipline, and the
four-situation formula.

Two limbs are missing from the reviewer entirely — the repetition of a
similar violation (incorrigibility), and condonation in both its forms.
The words condonation, clean slate and incorrigible appear nowhere in
the document. The addendum also notes that par 3241's formula reads as an
automatic rule and should be read down to match par 3189.

Co-Authored-By: Claude Opus 5 <noreply@anthropic.com>
Claude-Session: https://claude.ai/code/session_01E6GJeQzXcrxYvHo2i7wGh9
</commit_message>
<xml_diff>
--- a/Docx/Labor_Law_Review_1_v19_NonDigest_Corrections.docx
+++ b/Docx/Labor_Law_Review_1_v19_NonDigest_Corrections.docx
@@ -111,6 +111,14 @@
           <w:b w:val="0"/>
         </w:rPr>
         <w:t>The Labor Code (P.D. 442), R.A. 10151 and R.A. 8042 were opened and the quotations compared against them. Case-based propositions were checked against the decisions already retrieved for the digest audit. Seven defects were found. Everything else held.</w:t>
+      </w:r>
+    </w:p>
+    <w:p>
+      <w:r>
+        <w:rPr>
+          <w:b w:val="0"/>
+        </w:rPr>
+        <w:t>An addendum follows the corrections. It sets out the computation and appreciation of infractions under the totality of infractions doctrine, taken from the class discussion transcript, and supplies two limbs the reviewer does not carry at all.</w:t>
       </w:r>
     </w:p>
     <w:p>
@@ -715,9 +723,250 @@
     <w:p>
       <w:r>
         <w:rPr>
+          <w:b/>
+        </w:rPr>
+        <w:t>ADDENDUM — COMPUTATION AND APPRECIATION OF INFRACTIONS UNDER THE TOTALITY OF INFRACTIONS DOCTRINE</w:t>
+      </w:r>
+    </w:p>
+    <w:p>
+      <w:r>
+        <w:rPr>
           <w:b w:val="0"/>
         </w:rPr>
-        <w:t>End — 7 corrections, 3 smaller points, in 1,477 paragraphs of non-digest material.</w:t>
+        <w:t>Source: the class discussion transcript (Part 1). The transcript is an automatic transcription and garbles several words — condonation appears as "condemnation" and "combination," Sagales as "Sagalis," Ganco Resort as "Catco Resort," disparate as "desperate." What follows is the discussion read through those slips. It is set out here because two of its limbs are missing from the reviewer entirely: the words condonation, clean slate and incorrigible do not appear anywhere in the document.</w:t>
+      </w:r>
+    </w:p>
+    <w:p>
+      <w:r>
+        <w:rPr>
+          <w:b/>
+        </w:rPr>
+        <w:t>A.  The ladder of penalties</w:t>
+      </w:r>
+    </w:p>
+    <w:p>
+      <w:r>
+        <w:rPr>
+          <w:b w:val="0"/>
+        </w:rPr>
+        <w:t>The discussion runs the disciplinary penalties in ascending order: reprimand; warning; then suspension, or a transfer to a position where the employee's skills or attitude are a better fit; then demotion; and finally dismissal, which the lecture calls "the death penalty" of labor cases.</w:t>
+      </w:r>
+    </w:p>
+    <w:p>
+      <w:r>
+        <w:rPr>
+          <w:b/>
+        </w:rPr>
+        <w:t>B.  Condonation, and its two kinds</w:t>
+      </w:r>
+    </w:p>
+    <w:p>
+      <w:r>
+        <w:rPr>
+          <w:b w:val="0"/>
+        </w:rPr>
+        <w:t>When an infraction is brought up with the employee, the employer may condone it. There are two kinds, and they have different consequences:</w:t>
+      </w:r>
+    </w:p>
+    <w:p>
+      <w:pPr>
+        <w:pStyle w:val="ListBullet"/>
+      </w:pPr>
+      <w:r>
+        <w:rPr>
+          <w:b w:val="0"/>
+        </w:rPr>
+        <w:t>Express condonation. The employer forgives the misdeed in terms — the example given is an employee habitually late for a week who is told, in effect, "you have always been late this past week; I will give you a chance." The consequence is the CLEAN SLATE RULE: a subsequent offense of a similar nature cannot be aggravated by invoking the condoned one.</w:t>
+      </w:r>
+    </w:p>
+    <w:p>
+      <w:pPr>
+        <w:pStyle w:val="ListBullet"/>
+      </w:pPr>
+      <w:r>
+        <w:rPr>
+          <w:b w:val="0"/>
+        </w:rPr>
+        <w:t>Implied condonation. The superior knows of the infractions — the example is an employee habitually absent, whose superior sees the absences — and does nothing about them. Here the condoned offense MAY still be used to aggravate a subsequent similar offense, and a heavier penalty may be imposed on that footing.</w:t>
+      </w:r>
+    </w:p>
+    <w:p>
+      <w:r>
+        <w:rPr>
+          <w:b w:val="0"/>
+        </w:rPr>
+        <w:t>The lecture adds a caution worth keeping: condoning one act is not condoning the same act if it is committed again in the future.</w:t>
+      </w:r>
+    </w:p>
+    <w:p>
+      <w:r>
+        <w:rPr>
+          <w:b w:val="0"/>
+        </w:rPr>
+        <w:t>Note for the reviewer: this entire framework is absent from the document. If it is added, the implied-condonation limb in particular should be given an authority, since it is the proposition an examiner is most likely to want a case behind — express condonation producing a clean slate is the intuitive half; implied condonation still permitting aggravation is not.</w:t>
+      </w:r>
+    </w:p>
+    <w:p>
+      <w:r>
+        <w:rPr>
+          <w:b/>
+        </w:rPr>
+        <w:t>C.  Limitations on the power to discipline</w:t>
+      </w:r>
+    </w:p>
+    <w:p>
+      <w:r>
+        <w:rPr>
+          <w:b w:val="0"/>
+        </w:rPr>
+        <w:t>Three were given: the exercise must not be oppressive or abusive; it must be tempered with compassion; and the penalty must be proportionate to the offense. The governing principles named are the totality of infractions rule and the reasonable proportionality rule, whose poster case is Sagales v. Rustan's Commercial Corporation, G.R. No. 166554, November 27, 2008.</w:t>
+      </w:r>
+    </w:p>
+    <w:p>
+      <w:r>
+        <w:rPr>
+          <w:b/>
+        </w:rPr>
+        <w:t>D.  The formula — four situations</w:t>
+      </w:r>
+    </w:p>
+    <w:p>
+      <w:r>
+        <w:rPr>
+          <w:b w:val="0"/>
+        </w:rPr>
+        <w:t>The lecture gives this as a formula for working out the proper penalty. The four situations are distinguished by what the past infraction was and how it was dealt with:</w:t>
+      </w:r>
+    </w:p>
+    <w:p>
+      <w:pPr>
+        <w:pStyle w:val="ListBullet"/>
+      </w:pPr>
+      <w:r>
+        <w:rPr>
+          <w:b w:val="0"/>
+        </w:rPr>
+        <w:t>1. Past violation + a subsequent SIMILAR violation. The penalty is serious, because the repetition shows the employee is incorrigible.</w:t>
+      </w:r>
+    </w:p>
+    <w:p>
+      <w:pPr>
+        <w:pStyle w:val="ListBullet"/>
+      </w:pPr>
+      <w:r>
+        <w:rPr>
+          <w:b w:val="0"/>
+        </w:rPr>
+        <w:t>2. Past infraction + a DIFFERENT infraction. This is treated as a badge of bad faith, or of poor performance, on the employee's part.</w:t>
+      </w:r>
+    </w:p>
+    <w:p>
+      <w:pPr>
+        <w:pStyle w:val="ListBullet"/>
+      </w:pPr>
+      <w:r>
+        <w:rPr>
+          <w:b w:val="0"/>
+        </w:rPr>
+        <w:t>3. Past infraction ALREADY ADMINISTRATIVELY DEALT WITH — the employee was asked to explain, the explanation was found unsatisfactory, and a penalty (say a five-day suspension) was imposed. General rule: it cannot be invoked anew to aggravate the penalty for a subsequent violation, labor law having its own principle of no double jeopardy. Exception: where the penalty carried a WARNING — "you are hereby warned that a subsequent offense will merit dismissal" — the past misdeed may be resurrected and used to aggravate. Villanueva v. Ganco Resort and Recreation, Inc., G.R. No. 227175, January 8, 2020.</w:t>
+      </w:r>
+    </w:p>
+    <w:p>
+      <w:pPr>
+        <w:pStyle w:val="ListBullet"/>
+      </w:pPr>
+      <w:r>
+        <w:rPr>
+          <w:b w:val="0"/>
+        </w:rPr>
+        <w:t>4. Past infraction where the employee was NEVER ASKED TO EXPLAIN and was never administratively dealt with. It may be used to aggravate the penalty for a subsequent misdeed.</w:t>
+      </w:r>
+    </w:p>
+    <w:p>
+      <w:r>
+        <w:rPr>
+          <w:b w:val="0"/>
+        </w:rPr>
+        <w:t>The organising idea is the one the reviewer states at par. 3242: under the totality of infractions, the number of violations an employee has committed is taken into account in fixing the proper imposable penalty. Situations 1 and 2 go to the character of the record; situations 3 and 4 go to whether a past entry in that record may be counted at all.</w:t>
+      </w:r>
+    </w:p>
+    <w:p>
+      <w:r>
+        <w:rPr>
+          <w:b/>
+        </w:rPr>
+        <w:t>E.  How this sits with the reviewer</w:t>
+      </w:r>
+    </w:p>
+    <w:p>
+      <w:pPr>
+        <w:pStyle w:val="ListBullet"/>
+      </w:pPr>
+      <w:r>
+        <w:rPr>
+          <w:b w:val="0"/>
+        </w:rPr>
+        <w:t>Situations 2, 3 and 4 are already in the document, at pars. 3183 to 3187, with the warning exception and Villanueva at par. 3186. Nothing there needs correcting.</w:t>
+      </w:r>
+    </w:p>
+    <w:p>
+      <w:pPr>
+        <w:pStyle w:val="ListBullet"/>
+      </w:pPr>
+      <w:r>
+        <w:rPr>
+          <w:b w:val="0"/>
+        </w:rPr>
+        <w:t>Situation 1 — repetition of a SIMILAR violation, and the incorrigibility it establishes — is not in the document. Par. 3183 covers only the different-infraction case, so the simplest of the four situations is the one missing. Add it ahead of par. 3183.</w:t>
+      </w:r>
+    </w:p>
+    <w:p>
+      <w:pPr>
+        <w:pStyle w:val="ListBullet"/>
+      </w:pPr>
+      <w:r>
+        <w:rPr>
+          <w:b w:val="0"/>
+        </w:rPr>
+        <w:t>Condonation, express and implied, is not in the document at all. It belongs with the discipline material at pars. 3182 to 3187, because it decides, before any of the four situations is reached, whether a past infraction is still on the record to be counted.</w:t>
+      </w:r>
+    </w:p>
+    <w:p>
+      <w:pPr>
+        <w:pStyle w:val="ListBullet"/>
+      </w:pPr>
+      <w:r>
+        <w:rPr>
+          <w:b w:val="0"/>
+        </w:rPr>
+        <w:t>The reviewer carries one refinement the discussion does not: par. 3189 says to look at the words accompanying the warning — a general warning means the next penalty may be heavier, not that dismissal follows automatically. That is narrower than the formula at par. 3241 ("prior offenses + subsequent offense, w/ warning = dismissal"), and it is the better statement. Par. 3241 should be read down to match par. 3189, or it will be quoted as an automatic rule.</w:t>
+      </w:r>
+    </w:p>
+    <w:p>
+      <w:pPr>
+        <w:pStyle w:val="ListBullet"/>
+      </w:pPr>
+      <w:r>
+        <w:rPr>
+          <w:b w:val="0"/>
+        </w:rPr>
+        <w:t>The factors for fixing the penalty at pars. 3223 to 3228 — length of service and derogatory record, value of the property, cost or damage to the employer, effect on the viability of operations, and whether the employee holds a position of trust — are the appreciation side of the same doctrine, and they check out against Sagales and Villanueva. Keep them with this material.</w:t>
+      </w:r>
+    </w:p>
+    <w:p>
+      <w:r>
+        <w:rPr>
+          <w:b w:val="0"/>
+        </w:rPr>
+        <w:t>____________________________________________________________________________________________</w:t>
+      </w:r>
+    </w:p>
+    <w:p>
+      <w:r>
+        <w:rPr>
+          <w:b w:val="0"/>
+        </w:rPr>
+        <w:t>End — 7 corrections, 3 smaller points, and one addendum, in 1,477 paragraphs of non-digest material.</w:t>
       </w:r>
     </w:p>
     <w:sectPr>

</xml_diff>

<commit_message>
Add table-by-table review to the non-digest corrections
Read all 15 tables row by row rather than by header. Thirteen are sound
and their figures verified (RA 8042 penalties, POEA-SEC amounts, the
Bacani P100,000 nominal damages, RA 9501 MSME thresholds).

Two points added: tables 2 and 3 call life imprisonment for syndicated
or large-scale illegal recruitment non-bailable, which overstates the
rule under Art III Sec 13 and Rule 114; and table 10 contradicts par 2937
on the Sonza/Tiangco talent fees, repeating the B3 defect.

Also corrects the earlier characterisation of tables 6 and 9 as
duplicates: they overlap but are not identical.

Co-Authored-By: Claude Opus 5 <noreply@anthropic.com>
Claude-Session: https://claude.ai/code/session_01E6GJeQzXcrxYvHo2i7wGh9
</commit_message>
<xml_diff>
--- a/Docx/Labor_Law_Review_1_v19_NonDigest_Corrections.docx
+++ b/Docx/Labor_Law_Review_1_v19_NonDigest_Corrections.docx
@@ -611,7 +611,61 @@
         <w:rPr>
           <w:b w:val="0"/>
         </w:rPr>
-        <w:t>Tables 6 and 9 are duplicates of each other — both are headed "Basis | Stock Sale | Asset Sale." One can be deleted.</w:t>
+        <w:t>Tables 6 and 9 both set out the stock sale / asset sale distinction under the same heading. They are not word-for-word identical — table 6 has four rows of content and table 9 three, and the wording differs — but they cover the same ground and say the same thing. Merge them, keeping table 6's fourth row on the buyer's liability, which table 9 lacks.</w:t>
+      </w:r>
+    </w:p>
+    <w:p>
+      <w:r>
+        <w:rPr>
+          <w:b w:val="0"/>
+        </w:rPr>
+        <w:t>____________________________________________________________________________________________</w:t>
+      </w:r>
+    </w:p>
+    <w:p>
+      <w:r>
+        <w:rPr>
+          <w:b/>
+        </w:rPr>
+        <w:t>THE TABLES</w:t>
+      </w:r>
+    </w:p>
+    <w:p>
+      <w:r>
+        <w:rPr>
+          <w:b w:val="0"/>
+        </w:rPr>
+        <w:t>All fifteen tables were read row by row. Thirteen are sound, and the figures in them check out: the illegal recruitment penalties in table 2 against Sec. 7 of R.A. 8042 as amended by R.A. 10022 (12 years and 1 day to 20 years with a fine of P1,000,000 to P2,000,000 for simple illegal recruitment; life imprisonment with a fine of P2,000,000 to P5,000,000 for economic sabotage; 6 years and 1 day to 12 years with a fine of P500,000 to P1,000,000 for the acts added by R.A. 10022); the POEA-SEC figures in table 4 (US$50,000 death benefit, US$7,000 per child up to four children, US$60,000 for Grade 1 disability); the nominal damages in table 8, including the P100,000 per employee for a flexible work arrangement adopted without notice to the DOLE, which Bacani v. Fiber Textile Manufacturing Corp., G.R. No. 271518, September 30, 2025 (En Banc) does fix at that amount; and the MSME thresholds in table 13 against R.A. 9501. Tables 5, 7 and 14 match the decisions they summarise, all of which were opened during the digest audit.</w:t>
+      </w:r>
+    </w:p>
+    <w:p>
+      <w:r>
+        <w:rPr>
+          <w:b w:val="0"/>
+        </w:rPr>
+        <w:t>Two points arise:</w:t>
+      </w:r>
+    </w:p>
+    <w:p>
+      <w:pPr>
+        <w:pStyle w:val="ListBullet"/>
+      </w:pPr>
+      <w:r>
+        <w:rPr>
+          <w:b w:val="0"/>
+        </w:rPr>
+        <w:t>Tables 2 and 3 both describe life imprisonment for syndicated or large-scale illegal recruitment as “non-bailable.” That overstates it. Under Art. III, Sec. 13 of the Constitution and Rule 114 of the Rules of Criminal Procedure, an offense punishable by reclusion perpetua or life imprisonment is bailable unless the evidence of guilt is strong; bail becomes discretionary and is denied only on that finding, after a hearing. Write it as bail being discretionary, and denied where the evidence of guilt is strong, rather than as non-bailable.</w:t>
+      </w:r>
+    </w:p>
+    <w:p>
+      <w:pPr>
+        <w:pStyle w:val="ListBullet"/>
+      </w:pPr>
+      <w:r>
+        <w:rPr>
+          <w:b w:val="0"/>
+        </w:rPr>
+        <w:t>Table 10 contradicts the text. The table puts the Sonza and Tiangco talent fees together at “upwards of P300,000 a month,” while par. 2937 gives Sonza monthly and Tiangco annually (roughly P410,000 to P417,000 a year). The two cannot both be right, and the table repeats the very defect flagged as B3 in the earlier revision — comparing figures stated on different bases. Fix the table and par. 2937 together, putting both talent fees on the same footing.</w:t>
       </w:r>
     </w:p>
     <w:p>
@@ -966,7 +1020,7 @@
         <w:rPr>
           <w:b w:val="0"/>
         </w:rPr>
-        <w:t>End — 7 corrections, 3 smaller points, and one addendum, in 1,477 paragraphs of non-digest material.</w:t>
+        <w:t>End — 7 corrections, 3 smaller points, 2 points on the tables, and one addendum, across 1,477 paragraphs of non-digest material and all 15 tables.</w:t>
       </w:r>
     </w:p>
     <w:sectPr>

</xml_diff>